<commit_message>
debug: adjust the proportion of Fact-Finding Techniques
</commit_message>
<xml_diff>
--- a/report/First Brief Report.docx
+++ b/report/First Brief Report.docx
@@ -48,15 +48,15 @@
         <w:tblLook w:val="04a0" w:noHBand="0" w:noVBand="1" w:firstColumn="1" w:lastRow="0" w:lastColumn="0" w:firstRow="1"/>
       </w:tblPr>
       <w:tblGrid>
-        <w:gridCol w:w="1837"/>
-        <w:gridCol w:w="3119"/>
+        <w:gridCol w:w="1836"/>
+        <w:gridCol w:w="3120"/>
         <w:gridCol w:w="4060"/>
       </w:tblGrid>
       <w:tr>
         <w:trPr/>
         <w:tc>
           <w:tcPr>
-            <w:tcW w:w="1837" w:type="dxa"/>
+            <w:tcW w:w="1836" w:type="dxa"/>
             <w:tcBorders/>
           </w:tcPr>
           <w:p>
@@ -77,7 +77,7 @@
         </w:tc>
         <w:tc>
           <w:tcPr>
-            <w:tcW w:w="7179" w:type="dxa"/>
+            <w:tcW w:w="7180" w:type="dxa"/>
             <w:gridSpan w:val="2"/>
             <w:tcBorders/>
           </w:tcPr>
@@ -101,7 +101,7 @@
         <w:trPr/>
         <w:tc>
           <w:tcPr>
-            <w:tcW w:w="1837" w:type="dxa"/>
+            <w:tcW w:w="1836" w:type="dxa"/>
             <w:tcBorders/>
           </w:tcPr>
           <w:p>
@@ -122,7 +122,7 @@
         </w:tc>
         <w:tc>
           <w:tcPr>
-            <w:tcW w:w="3119" w:type="dxa"/>
+            <w:tcW w:w="3120" w:type="dxa"/>
             <w:tcBorders/>
           </w:tcPr>
           <w:p>
@@ -167,7 +167,7 @@
         <w:trPr/>
         <w:tc>
           <w:tcPr>
-            <w:tcW w:w="1837" w:type="dxa"/>
+            <w:tcW w:w="1836" w:type="dxa"/>
             <w:tcBorders/>
           </w:tcPr>
           <w:p>
@@ -188,7 +188,7 @@
         </w:tc>
         <w:tc>
           <w:tcPr>
-            <w:tcW w:w="3119" w:type="dxa"/>
+            <w:tcW w:w="3120" w:type="dxa"/>
             <w:tcBorders/>
           </w:tcPr>
           <w:p>
@@ -233,7 +233,7 @@
         <w:trPr/>
         <w:tc>
           <w:tcPr>
-            <w:tcW w:w="1837" w:type="dxa"/>
+            <w:tcW w:w="1836" w:type="dxa"/>
             <w:tcBorders/>
           </w:tcPr>
           <w:p>
@@ -254,7 +254,7 @@
         </w:tc>
         <w:tc>
           <w:tcPr>
-            <w:tcW w:w="3119" w:type="dxa"/>
+            <w:tcW w:w="3120" w:type="dxa"/>
             <w:tcBorders/>
           </w:tcPr>
           <w:p>
@@ -299,7 +299,7 @@
         <w:trPr/>
         <w:tc>
           <w:tcPr>
-            <w:tcW w:w="1837" w:type="dxa"/>
+            <w:tcW w:w="1836" w:type="dxa"/>
             <w:tcBorders/>
           </w:tcPr>
           <w:p>
@@ -320,7 +320,7 @@
         </w:tc>
         <w:tc>
           <w:tcPr>
-            <w:tcW w:w="3119" w:type="dxa"/>
+            <w:tcW w:w="3120" w:type="dxa"/>
             <w:tcBorders/>
           </w:tcPr>
           <w:p>
@@ -365,7 +365,7 @@
         <w:trPr/>
         <w:tc>
           <w:tcPr>
-            <w:tcW w:w="1837" w:type="dxa"/>
+            <w:tcW w:w="1836" w:type="dxa"/>
             <w:tcBorders/>
           </w:tcPr>
           <w:p>
@@ -386,7 +386,7 @@
         </w:tc>
         <w:tc>
           <w:tcPr>
-            <w:tcW w:w="3119" w:type="dxa"/>
+            <w:tcW w:w="3120" w:type="dxa"/>
             <w:tcBorders/>
           </w:tcPr>
           <w:p>
@@ -431,7 +431,7 @@
         <w:trPr/>
         <w:tc>
           <w:tcPr>
-            <w:tcW w:w="1837" w:type="dxa"/>
+            <w:tcW w:w="1836" w:type="dxa"/>
             <w:tcBorders/>
           </w:tcPr>
           <w:p>
@@ -452,7 +452,7 @@
         </w:tc>
         <w:tc>
           <w:tcPr>
-            <w:tcW w:w="3119" w:type="dxa"/>
+            <w:tcW w:w="3120" w:type="dxa"/>
             <w:tcBorders/>
           </w:tcPr>
           <w:p>
@@ -556,7 +556,7 @@
       </w:pPr>
       <w:r>
         <w:rPr>
-          <w:rFonts w:eastAsia="等线 Light" w:cs="Times New Roman" w:cstheme="majorBidi" w:eastAsiaTheme="majorEastAsia" w:ascii="Times New Roman" w:hAnsi="Times New Roman"/>
+          <w:rFonts w:eastAsia="等线 Light" w:cs="Times New Roman" w:ascii="Times New Roman" w:hAnsi="Times New Roman" w:cstheme="majorBidi" w:eastAsiaTheme="majorEastAsia"/>
           <w:b w:val="false"/>
           <w:bCs w:val="false"/>
           <w:color w:val="0F4761" w:themeColor="accent1" w:themeShade="bf"/>
@@ -568,356 +568,331 @@
     </w:p>
     <w:p>
       <w:pPr>
-        <w:pStyle w:val="Normal"/>
-        <w:rPr>
-          <w:rFonts w:ascii="Times New Roman" w:hAnsi="Times New Roman" w:cs="Times New Roman"/>
-        </w:rPr>
-      </w:pPr>
-      <w:r>
-        <w:rPr>
-          <w:rFonts w:cs="Times New Roman" w:ascii="Times New Roman" w:hAnsi="Times New Roman"/>
-        </w:rPr>
-        <w:t>To identify the requirements of the system, our group used several simple fact-finding techniques. The project brief gives the general background of the system, but more detailed user needs still had to be identified. Therefore, we further analysed the scenario from the perspectives of different users and used this to support the backlog and prototype design.</w:t>
-      </w:r>
-    </w:p>
-    <w:p>
-      <w:pPr>
-        <w:pStyle w:val="Normal"/>
-        <w:rPr>
-          <w:rFonts w:ascii="Times New Roman" w:hAnsi="Times New Roman" w:cs="Times New Roman"/>
-        </w:rPr>
-      </w:pPr>
-      <w:r>
-        <w:rPr>
-          <w:rFonts w:cs="Times New Roman" w:ascii="Times New Roman" w:hAnsi="Times New Roman"/>
-        </w:rPr>
-        <w:t>First, we reviewed the project brief carefully. This helped us understand the current recruitment process, the main user roles, and the basic functions expected in the system. From the brief, we identified three main roles: TA applicants, Module Organisers, and administrators. We also noted that the current process relies on forms and Excel files, so one important aim of the system is to make the workflow clearer and more efficient.</w:t>
-      </w:r>
-    </w:p>
-    <w:p>
-      <w:pPr>
-        <w:pStyle w:val="Normal"/>
-        <w:rPr>
-          <w:rFonts w:ascii="Times New Roman" w:hAnsi="Times New Roman" w:eastAsia="等线 Light" w:cs="Times New Roman" w:cstheme="majorBidi" w:eastAsiaTheme="majorEastAsia"/>
+        <w:pStyle w:val="TextBody"/>
+        <w:rPr>
+          <w:rFonts w:ascii="Times New Roman" w:hAnsi="Times New Roman" w:cs="Times New Roman"/>
+        </w:rPr>
+      </w:pPr>
+      <w:r>
+        <w:rPr>
+          <w:rFonts w:cs="Times New Roman" w:ascii="Times New Roman" w:hAnsi="Times New Roman"/>
           <w:b w:val="false"/>
+          <w:i w:val="false"/>
+          <w:caps w:val="false"/>
+          <w:smallCaps w:val="false"/>
+          <w:color w:val="000000"/>
+          <w:spacing w:val="0"/>
+          <w:sz w:val="24"/>
+        </w:rPr>
+        <w:t xml:space="preserve">To identify the requirements of the system, our group used three main fact-finding techniques: </w:t>
+      </w:r>
+      <w:r>
+        <w:rPr>
+          <w:rFonts w:cs="Times New Roman" w:ascii="Times New Roman" w:hAnsi="Times New Roman"/>
+          <w:b/>
+          <w:i w:val="false"/>
+          <w:caps w:val="false"/>
+          <w:smallCaps w:val="false"/>
+          <w:color w:val="000000"/>
+          <w:spacing w:val="0"/>
+          <w:sz w:val="24"/>
+        </w:rPr>
+        <w:t>document analysis, group discussion, and simple interview-style questioning.</w:t>
+      </w:r>
+      <w:r>
+        <w:rPr>
+          <w:rFonts w:cs="Times New Roman" w:ascii="Times New Roman" w:hAnsi="Times New Roman"/>
+          <w:caps w:val="false"/>
+          <w:smallCaps w:val="false"/>
+          <w:color w:val="000000"/>
+          <w:spacing w:val="0"/>
+        </w:rPr>
+        <w:t xml:space="preserve"> </w:t>
+      </w:r>
+      <w:r>
+        <w:rPr>
+          <w:rFonts w:cs="Times New Roman" w:ascii="Times New Roman" w:hAnsi="Times New Roman"/>
           <w:b w:val="false"/>
-          <w:bCs w:val="false"/>
-          <w:color w:val="0F4761" w:themeColor="accent1" w:themeShade="bf"/>
-          <w:sz w:val="32"/>
-          <w:szCs w:val="32"/>
-        </w:rPr>
-      </w:pPr>
-      <w:r>
-        <w:rPr>
-          <w:rFonts w:eastAsia="等线 Light" w:cs="Times New Roman" w:cstheme="majorBidi" w:eastAsiaTheme="majorEastAsia" w:ascii="Times New Roman" w:hAnsi="Times New Roman"/>
+          <w:i w:val="false"/>
+          <w:caps w:val="false"/>
+          <w:smallCaps w:val="false"/>
+          <w:color w:val="000000"/>
+          <w:spacing w:val="0"/>
+          <w:sz w:val="24"/>
+        </w:rPr>
+        <w:t>Although the project brief provided the general scenario and suggested system functions, more detailed user needs still had to be identified. Therefore, we analysed the recruitment process from the perspectives of different stakeholders and used the findings to support the backlog and prototype design.</w:t>
+      </w:r>
+    </w:p>
+    <w:p>
+      <w:pPr>
+        <w:pStyle w:val="TextBody"/>
+        <w:spacing w:lineRule="auto" w:line="273" w:before="0" w:after="160"/>
+        <w:ind w:left="0" w:right="0" w:hanging="0"/>
+        <w:jc w:val="left"/>
+        <w:rPr>
+          <w:rFonts w:ascii="Times New Roman" w:hAnsi="Times New Roman" w:eastAsia="等线" w:cs="Times New Roman" w:eastAsiaTheme="minorEastAsia"/>
           <w:b w:val="false"/>
-          <w:bCs w:val="false"/>
-          <w:color w:val="0F4761" w:themeColor="accent1" w:themeShade="bf"/>
-          <w:sz w:val="32"/>
-          <w:szCs w:val="32"/>
-        </w:rPr>
-        <w:t>1</w:t>
-      </w:r>
-      <w:r>
-        <w:rPr>
-          <w:rFonts w:eastAsia="等线 Light" w:cs="Times New Roman" w:cstheme="majorBidi" w:eastAsiaTheme="majorEastAsia" w:ascii="Times New Roman" w:hAnsi="Times New Roman"/>
+          <w:i w:val="false"/>
+          <w:caps w:val="false"/>
+          <w:smallCaps w:val="false"/>
+          <w:color w:val="000000"/>
+          <w:spacing w:val="0"/>
+          <w:kern w:val="2"/>
+          <w:sz w:val="24"/>
+          <w:szCs w:val="24"/>
+          <w:lang w:val="en-GB" w:eastAsia="zh-CN" w:bidi="ar-SA"/>
+          <w14:ligatures w14:val="standardContextual"/>
+        </w:rPr>
+      </w:pPr>
+      <w:r>
+        <w:rPr>
+          <w:rFonts w:eastAsia="等线" w:cs="Times New Roman" w:eastAsiaTheme="minorEastAsia" w:ascii="Times New Roman" w:hAnsi="Times New Roman"/>
           <w:b w:val="false"/>
-          <w:bCs w:val="false"/>
-          <w:color w:val="0F4761" w:themeColor="accent1" w:themeShade="bf"/>
-          <w:sz w:val="32"/>
-          <w:szCs w:val="32"/>
-        </w:rPr>
-        <w:t>.</w:t>
-      </w:r>
-      <w:r>
-        <w:rPr>
-          <w:rFonts w:eastAsia="等线 Light" w:cs="Times New Roman" w:cstheme="majorBidi" w:eastAsiaTheme="majorEastAsia" w:ascii="Times New Roman" w:hAnsi="Times New Roman"/>
+          <w:i w:val="false"/>
+          <w:caps w:val="false"/>
+          <w:smallCaps w:val="false"/>
+          <w:color w:val="000000"/>
+          <w:spacing w:val="0"/>
+          <w:kern w:val="2"/>
+          <w:sz w:val="24"/>
+          <w:szCs w:val="24"/>
+          <w:lang w:val="en-GB" w:eastAsia="zh-CN" w:bidi="ar-SA"/>
+          <w14:ligatures w14:val="standardContextual"/>
+        </w:rPr>
+        <w:t xml:space="preserve">First, we used </w:t>
+      </w:r>
+      <w:r>
+        <w:rPr>
+          <w:rFonts w:eastAsia="等线" w:cs="Times New Roman" w:eastAsiaTheme="minorEastAsia" w:ascii="Times New Roman" w:hAnsi="Times New Roman"/>
+          <w:b/>
+          <w:bCs/>
+          <w:i w:val="false"/>
+          <w:caps w:val="false"/>
+          <w:smallCaps w:val="false"/>
+          <w:color w:val="000000"/>
+          <w:spacing w:val="0"/>
+          <w:kern w:val="2"/>
+          <w:sz w:val="24"/>
+          <w:szCs w:val="24"/>
+          <w:lang w:val="en-GB" w:eastAsia="zh-CN" w:bidi="ar-SA"/>
+          <w14:ligatures w14:val="standardContextual"/>
+        </w:rPr>
+        <w:t>document analysis</w:t>
+      </w:r>
+      <w:r>
+        <w:rPr>
+          <w:rFonts w:eastAsia="等线" w:cs="Times New Roman" w:eastAsiaTheme="minorEastAsia" w:ascii="Times New Roman" w:hAnsi="Times New Roman"/>
           <w:b w:val="false"/>
-          <w:bCs w:val="false"/>
-          <w:color w:val="0F4761" w:themeColor="accent1" w:themeShade="bf"/>
-          <w:sz w:val="32"/>
-          <w:szCs w:val="32"/>
-        </w:rPr>
-        <w:t>2</w:t>
-      </w:r>
-      <w:r>
-        <w:rPr>
-          <w:rFonts w:eastAsia="等线 Light" w:cs="Times New Roman" w:cstheme="majorBidi" w:eastAsiaTheme="majorEastAsia" w:ascii="Times New Roman" w:hAnsi="Times New Roman"/>
+          <w:i w:val="false"/>
+          <w:caps w:val="false"/>
+          <w:smallCaps w:val="false"/>
+          <w:color w:val="000000"/>
+          <w:spacing w:val="0"/>
+          <w:kern w:val="2"/>
+          <w:sz w:val="24"/>
+          <w:szCs w:val="24"/>
+          <w:lang w:val="en-GB" w:eastAsia="zh-CN" w:bidi="ar-SA"/>
+          <w14:ligatures w14:val="standardContextual"/>
+        </w:rPr>
+        <w:t xml:space="preserve"> to examine the project brief. This helped us identify the current recruitment workflow, the main stakeholder groups, and the initial system scope. From the brief, we identified three main user roles: TA applicants, Module Organisers (MO), and administrators. We also noted that the current process relies on forms and Excel files, which suggests a need for a clearer and more efficient workflow. In addition, we briefly looked at similar TA recruitment practices in universities to understand common workflow structures. For example, XJTLU’s Teaching Assistant Management System suggests that a dedicated platform with clear user roles and structured recruitment stages can be useful in a similar educational context.</w:t>
+      </w:r>
+    </w:p>
+    <w:p>
+      <w:pPr>
+        <w:pStyle w:val="TextBody"/>
+        <w:spacing w:lineRule="auto" w:line="273" w:before="0" w:after="160"/>
+        <w:ind w:left="0" w:right="0" w:hanging="0"/>
+        <w:jc w:val="left"/>
+        <w:rPr>
+          <w:rFonts w:ascii="Times New Roman" w:hAnsi="Times New Roman" w:eastAsia="等线" w:cs="Times New Roman" w:eastAsiaTheme="minorEastAsia"/>
           <w:b w:val="false"/>
-          <w:bCs w:val="false"/>
-          <w:color w:val="0F4761" w:themeColor="accent1" w:themeShade="bf"/>
-          <w:sz w:val="32"/>
-          <w:szCs w:val="32"/>
-        </w:rPr>
-        <w:t xml:space="preserve"> Questions for TA Applicants</w:t>
-      </w:r>
-    </w:p>
-    <w:p>
-      <w:pPr>
-        <w:pStyle w:val="Normal"/>
-        <w:rPr>
-          <w:rFonts w:ascii="Times New Roman" w:hAnsi="Times New Roman" w:cs="Times New Roman"/>
-        </w:rPr>
-      </w:pPr>
-      <w:r>
-        <w:rPr>
-          <w:rFonts w:cs="Times New Roman" w:ascii="Times New Roman" w:hAnsi="Times New Roman"/>
-        </w:rPr>
-        <w:t>To better understand the TA side of the system, we prepared a few simple questions from the perspective of a student applicant.</w:t>
-      </w:r>
-    </w:p>
-    <w:p>
-      <w:pPr>
-        <w:pStyle w:val="Normal"/>
-        <w:rPr>
-          <w:rFonts w:ascii="Times New Roman" w:hAnsi="Times New Roman" w:cs="Times New Roman"/>
-        </w:rPr>
-      </w:pPr>
-      <w:r>
-        <w:rPr>
-          <w:rFonts w:cs="Times New Roman" w:ascii="Times New Roman" w:hAnsi="Times New Roman"/>
-        </w:rPr>
-        <w:t>What information would you like to see before applying for a TA job?</w:t>
-      </w:r>
-    </w:p>
-    <w:p>
-      <w:pPr>
-        <w:pStyle w:val="Normal"/>
-        <w:rPr>
-          <w:rFonts w:ascii="Times New Roman" w:hAnsi="Times New Roman" w:cs="Times New Roman"/>
-        </w:rPr>
-      </w:pPr>
-      <w:r>
-        <w:rPr>
-          <w:rFonts w:cs="Times New Roman" w:ascii="Times New Roman" w:hAnsi="Times New Roman"/>
-        </w:rPr>
-        <w:t>What personal details should be included in an applicant profile?</w:t>
-      </w:r>
-    </w:p>
-    <w:p>
-      <w:pPr>
-        <w:pStyle w:val="Normal"/>
-        <w:rPr>
-          <w:rFonts w:ascii="Times New Roman" w:hAnsi="Times New Roman" w:cs="Times New Roman"/>
-        </w:rPr>
-      </w:pPr>
-      <w:r>
-        <w:rPr>
-          <w:rFonts w:cs="Times New Roman" w:ascii="Times New Roman" w:hAnsi="Times New Roman"/>
-        </w:rPr>
-        <w:t>Do you think uploading a CV is necessary?</w:t>
-      </w:r>
-    </w:p>
-    <w:p>
-      <w:pPr>
-        <w:pStyle w:val="Normal"/>
-        <w:rPr>
-          <w:rFonts w:ascii="Times New Roman" w:hAnsi="Times New Roman" w:cs="Times New Roman"/>
-        </w:rPr>
-      </w:pPr>
-      <w:r>
-        <w:rPr>
-          <w:rFonts w:cs="Times New Roman" w:ascii="Times New Roman" w:hAnsi="Times New Roman"/>
-        </w:rPr>
-        <w:t>What is inconvenient about using forms or Excel files for TA applications?</w:t>
-      </w:r>
-    </w:p>
-    <w:p>
-      <w:pPr>
-        <w:pStyle w:val="Normal"/>
-        <w:rPr>
-          <w:rFonts w:ascii="Times New Roman" w:hAnsi="Times New Roman" w:cs="Times New Roman"/>
-        </w:rPr>
-      </w:pPr>
-      <w:r>
-        <w:rPr>
-          <w:rFonts w:cs="Times New Roman" w:ascii="Times New Roman" w:hAnsi="Times New Roman"/>
-        </w:rPr>
-        <w:t>Would you like to check your application status in the system?</w:t>
-      </w:r>
-    </w:p>
-    <w:p>
-      <w:pPr>
-        <w:pStyle w:val="Normal"/>
-        <w:rPr>
-          <w:rFonts w:ascii="Times New Roman" w:hAnsi="Times New Roman" w:cs="Times New Roman"/>
-        </w:rPr>
-      </w:pPr>
-      <w:r>
-        <w:rPr>
-          <w:rFonts w:cs="Times New Roman" w:ascii="Times New Roman" w:hAnsi="Times New Roman"/>
-        </w:rPr>
-        <w:t>If you apply for more than one job, what would make the process easier?</w:t>
-      </w:r>
-    </w:p>
-    <w:p>
-      <w:pPr>
-        <w:pStyle w:val="Normal"/>
-        <w:rPr>
-          <w:rFonts w:ascii="Times New Roman" w:hAnsi="Times New Roman" w:eastAsia="等线 Light" w:cs="Times New Roman" w:cstheme="majorBidi" w:eastAsiaTheme="majorEastAsia"/>
+          <w:i w:val="false"/>
+          <w:caps w:val="false"/>
+          <w:smallCaps w:val="false"/>
+          <w:color w:val="000000"/>
+          <w:spacing w:val="0"/>
+          <w:kern w:val="2"/>
+          <w:sz w:val="24"/>
+          <w:szCs w:val="24"/>
+          <w:lang w:val="en-GB" w:eastAsia="zh-CN" w:bidi="ar-SA"/>
+          <w14:ligatures w14:val="standardContextual"/>
+        </w:rPr>
+      </w:pPr>
+      <w:r>
+        <w:rPr>
+          <w:rFonts w:eastAsia="等线" w:cs="Times New Roman" w:eastAsiaTheme="minorEastAsia" w:ascii="Times New Roman" w:hAnsi="Times New Roman"/>
           <w:b w:val="false"/>
+          <w:i w:val="false"/>
+          <w:caps w:val="false"/>
+          <w:smallCaps w:val="false"/>
+          <w:color w:val="000000"/>
+          <w:spacing w:val="0"/>
+          <w:kern w:val="2"/>
+          <w:sz w:val="24"/>
+          <w:szCs w:val="24"/>
+          <w:lang w:val="en-GB" w:eastAsia="zh-CN" w:bidi="ar-SA"/>
+          <w14:ligatures w14:val="standardContextual"/>
+        </w:rPr>
+        <w:t xml:space="preserve">Second, we used </w:t>
+      </w:r>
+      <w:r>
+        <w:rPr>
+          <w:rFonts w:eastAsia="等线" w:cs="Times New Roman" w:eastAsiaTheme="minorEastAsia" w:ascii="Times New Roman" w:hAnsi="Times New Roman"/>
+          <w:b/>
+          <w:bCs/>
+          <w:i w:val="false"/>
+          <w:caps w:val="false"/>
+          <w:smallCaps w:val="false"/>
+          <w:color w:val="000000"/>
+          <w:spacing w:val="0"/>
+          <w:kern w:val="2"/>
+          <w:sz w:val="24"/>
+          <w:szCs w:val="24"/>
+          <w:lang w:val="en-GB" w:eastAsia="zh-CN" w:bidi="ar-SA"/>
+          <w14:ligatures w14:val="standardContextual"/>
+        </w:rPr>
+        <w:t>group discussion</w:t>
+      </w:r>
+      <w:r>
+        <w:rPr>
+          <w:rFonts w:eastAsia="等线" w:cs="Times New Roman" w:eastAsiaTheme="minorEastAsia" w:ascii="Times New Roman" w:hAnsi="Times New Roman"/>
           <w:b w:val="false"/>
-          <w:bCs w:val="false"/>
-          <w:color w:val="0F4761" w:themeColor="accent1" w:themeShade="bf"/>
-          <w:sz w:val="32"/>
-          <w:szCs w:val="32"/>
-        </w:rPr>
-      </w:pPr>
-      <w:r>
-        <w:rPr>
-          <w:rFonts w:eastAsia="等线 Light" w:cs="Times New Roman" w:cstheme="majorBidi" w:eastAsiaTheme="majorEastAsia" w:ascii="Times New Roman" w:hAnsi="Times New Roman"/>
+          <w:i w:val="false"/>
+          <w:caps w:val="false"/>
+          <w:smallCaps w:val="false"/>
+          <w:color w:val="000000"/>
+          <w:spacing w:val="0"/>
+          <w:kern w:val="2"/>
+          <w:sz w:val="24"/>
+          <w:szCs w:val="24"/>
+          <w:lang w:val="en-GB" w:eastAsia="zh-CN" w:bidi="ar-SA"/>
+          <w14:ligatures w14:val="standardContextual"/>
+        </w:rPr>
+        <w:t xml:space="preserve"> to explore the likely needs, tasks, and pain points of different stakeholders. By comparing the expectations of TA applicants, Module Organisers, and administrators, we moved from the high-level description in the brief to a more detailed set of initial requirements. This also helped us define a realistic scope for the first prototype rather than attempting to include every possible feature at once. Our discussion suggested that TA applicants mainly need functions such as viewing job information, creating a profile, uploading a CV, submitting applications, and checking application status. It also highlighted the need for Module Organisers to post vacancies, review applicants, and update recruitment decisions, as well as the need for administrators to monitor TA allocation and workload across the system.</w:t>
+      </w:r>
+    </w:p>
+    <w:p>
+      <w:pPr>
+        <w:pStyle w:val="TextBody"/>
+        <w:spacing w:lineRule="auto" w:line="273" w:before="0" w:after="160"/>
+        <w:ind w:left="0" w:right="0" w:hanging="0"/>
+        <w:jc w:val="left"/>
+        <w:rPr>
+          <w:rFonts w:ascii="Times New Roman" w:hAnsi="Times New Roman" w:eastAsia="等线" w:cs="Times New Roman" w:eastAsiaTheme="minorEastAsia"/>
           <w:b w:val="false"/>
-          <w:bCs w:val="false"/>
-          <w:color w:val="0F4761" w:themeColor="accent1" w:themeShade="bf"/>
-          <w:sz w:val="32"/>
-          <w:szCs w:val="32"/>
-        </w:rPr>
-        <w:t>1</w:t>
-      </w:r>
-      <w:r>
-        <w:rPr>
-          <w:rFonts w:eastAsia="等线 Light" w:cs="Times New Roman" w:cstheme="majorBidi" w:eastAsiaTheme="majorEastAsia" w:ascii="Times New Roman" w:hAnsi="Times New Roman"/>
+          <w:i w:val="false"/>
+          <w:caps w:val="false"/>
+          <w:smallCaps w:val="false"/>
+          <w:color w:val="000000"/>
+          <w:spacing w:val="0"/>
+          <w:kern w:val="2"/>
+          <w:sz w:val="24"/>
+          <w:szCs w:val="24"/>
+          <w:lang w:val="en-GB" w:eastAsia="zh-CN" w:bidi="ar-SA"/>
+          <w14:ligatures w14:val="standardContextual"/>
+        </w:rPr>
+      </w:pPr>
+      <w:r>
+        <w:rPr>
+          <w:rFonts w:eastAsia="等线" w:cs="Times New Roman" w:eastAsiaTheme="minorEastAsia" w:ascii="Times New Roman" w:hAnsi="Times New Roman"/>
           <w:b w:val="false"/>
-          <w:bCs w:val="false"/>
-          <w:color w:val="0F4761" w:themeColor="accent1" w:themeShade="bf"/>
-          <w:sz w:val="32"/>
-          <w:szCs w:val="32"/>
-        </w:rPr>
-        <w:t>.3 Summary of Findings</w:t>
-      </w:r>
-    </w:p>
-    <w:p>
-      <w:pPr>
-        <w:pStyle w:val="Normal"/>
-        <w:rPr>
-          <w:rFonts w:ascii="Times New Roman" w:hAnsi="Times New Roman" w:cs="Times New Roman"/>
-        </w:rPr>
-      </w:pPr>
-      <w:r>
-        <w:rPr>
-          <w:rFonts w:cs="Times New Roman" w:ascii="Times New Roman" w:hAnsi="Times New Roman"/>
-        </w:rPr>
-        <w:t>This interview suggests that TA applicants mainly care about clear job information, simple profile creation, CV upload, applying for more than one job more easily, and checking application status. These points were used to support the TA-related user stories and the first version of the prototype. They are also consistent with the TA-side functions suggested in the project brief.</w:t>
-      </w:r>
-    </w:p>
-    <w:p>
-      <w:pPr>
-        <w:pStyle w:val="Normal"/>
-        <w:rPr>
-          <w:rFonts w:ascii="Times New Roman" w:hAnsi="Times New Roman" w:cs="Times New Roman"/>
-        </w:rPr>
-      </w:pPr>
-      <w:r>
-        <w:rPr>
-          <w:rFonts w:cs="Times New Roman" w:ascii="Times New Roman" w:hAnsi="Times New Roman"/>
-        </w:rPr>
-        <w:t>From the TA perspective, several needs were identified.</w:t>
-      </w:r>
-    </w:p>
-    <w:p>
-      <w:pPr>
-        <w:pStyle w:val="Normal"/>
-        <w:rPr>
-          <w:rFonts w:ascii="Times New Roman" w:hAnsi="Times New Roman" w:cs="Times New Roman"/>
-        </w:rPr>
-      </w:pPr>
-      <w:r>
-        <w:rPr>
-          <w:rFonts w:cs="Times New Roman" w:ascii="Times New Roman" w:hAnsi="Times New Roman"/>
-        </w:rPr>
-        <w:t>First, applicants need clear job information before applying, such as the module name, basic responsibilities, and requirements. Second, they need a simple way to create a profile and upload a CV. Third, they need to browse available jobs and submit applications online. Finally, they want to check the status of their applications after submission.</w:t>
-      </w:r>
-    </w:p>
-    <w:p>
-      <w:pPr>
-        <w:pStyle w:val="Normal"/>
-        <w:rPr>
-          <w:rFonts w:ascii="Times New Roman" w:hAnsi="Times New Roman" w:cs="Times New Roman"/>
-        </w:rPr>
-      </w:pPr>
-      <w:r>
-        <w:rPr>
-          <w:rFonts w:cs="Times New Roman" w:ascii="Times New Roman" w:hAnsi="Times New Roman"/>
-        </w:rPr>
-        <w:t>These points are consistent with the suggested TA-side functions in the project brief, including creating a profile, uploading a CV, finding available jobs, applying for jobs, and checking application status.</w:t>
-      </w:r>
-    </w:p>
-    <w:p>
-      <w:pPr>
-        <w:pStyle w:val="Normal"/>
-        <w:rPr>
-          <w:rFonts w:ascii="Times New Roman" w:hAnsi="Times New Roman" w:eastAsia="等线 Light" w:cs="Times New Roman" w:cstheme="majorBidi" w:eastAsiaTheme="majorEastAsia"/>
+          <w:i w:val="false"/>
+          <w:caps w:val="false"/>
+          <w:smallCaps w:val="false"/>
+          <w:color w:val="000000"/>
+          <w:spacing w:val="0"/>
+          <w:kern w:val="2"/>
+          <w:sz w:val="24"/>
+          <w:szCs w:val="24"/>
+          <w:lang w:val="en-GB" w:eastAsia="zh-CN" w:bidi="ar-SA"/>
+          <w14:ligatures w14:val="standardContextual"/>
+        </w:rPr>
+        <w:t xml:space="preserve">Third, we used </w:t>
+      </w:r>
+      <w:r>
+        <w:rPr>
+          <w:rFonts w:eastAsia="等线" w:cs="Times New Roman" w:eastAsiaTheme="minorEastAsia" w:ascii="Times New Roman" w:hAnsi="Times New Roman"/>
+          <w:b/>
+          <w:bCs/>
+          <w:i w:val="false"/>
+          <w:caps w:val="false"/>
+          <w:smallCaps w:val="false"/>
+          <w:color w:val="000000"/>
+          <w:spacing w:val="0"/>
+          <w:kern w:val="2"/>
+          <w:sz w:val="24"/>
+          <w:szCs w:val="24"/>
+          <w:lang w:val="en-GB" w:eastAsia="zh-CN" w:bidi="ar-SA"/>
+          <w14:ligatures w14:val="standardContextual"/>
+        </w:rPr>
+        <w:t>simple interview-style questions</w:t>
+      </w:r>
+      <w:r>
+        <w:rPr>
+          <w:rFonts w:eastAsia="等线" w:cs="Times New Roman" w:eastAsiaTheme="minorEastAsia" w:ascii="Times New Roman" w:hAnsi="Times New Roman"/>
           <w:b w:val="false"/>
+          <w:i w:val="false"/>
+          <w:caps w:val="false"/>
+          <w:smallCaps w:val="false"/>
+          <w:color w:val="000000"/>
+          <w:spacing w:val="0"/>
+          <w:kern w:val="2"/>
+          <w:sz w:val="24"/>
+          <w:szCs w:val="24"/>
+          <w:lang w:val="en-GB" w:eastAsia="zh-CN" w:bidi="ar-SA"/>
+          <w14:ligatures w14:val="standardContextual"/>
+        </w:rPr>
+        <w:t xml:space="preserve"> to examine user needs in a more practical way. These questions focused on issues such as what information should appear in a job post, what information applicants should provide, what makes the current spreadsheet-based process inconvenient, and whether users would benefit from status tracking and clearer recruitment stages. This technique was especially useful for refining the TA-side workflow in the first prototype, while still keeping the wider needs of MO and Admin users in the backlog for later iterations.</w:t>
+      </w:r>
+    </w:p>
+    <w:p>
+      <w:pPr>
+        <w:pStyle w:val="TextBody"/>
+        <w:spacing w:lineRule="auto" w:line="273" w:before="0" w:after="160"/>
+        <w:ind w:left="0" w:right="0" w:hanging="0"/>
+        <w:jc w:val="left"/>
+        <w:rPr>
+          <w:rFonts w:ascii="Times New Roman" w:hAnsi="Times New Roman" w:eastAsia="等线" w:cs="Times New Roman" w:eastAsiaTheme="minorEastAsia"/>
           <w:b w:val="false"/>
-          <w:bCs w:val="false"/>
-          <w:color w:val="0F4761" w:themeColor="accent1" w:themeShade="bf"/>
-          <w:sz w:val="32"/>
-          <w:szCs w:val="32"/>
-        </w:rPr>
-      </w:pPr>
-      <w:r>
-        <w:rPr>
-          <w:rFonts w:eastAsia="等线 Light" w:cs="Times New Roman" w:cstheme="majorBidi" w:eastAsiaTheme="majorEastAsia" w:ascii="Times New Roman" w:hAnsi="Times New Roman"/>
+          <w:i w:val="false"/>
+          <w:caps w:val="false"/>
+          <w:smallCaps w:val="false"/>
+          <w:color w:val="000000"/>
+          <w:spacing w:val="0"/>
+          <w:kern w:val="2"/>
+          <w:sz w:val="24"/>
+          <w:szCs w:val="24"/>
+          <w:lang w:val="en-GB" w:eastAsia="zh-CN" w:bidi="ar-SA"/>
+          <w14:ligatures w14:val="standardContextual"/>
+        </w:rPr>
+      </w:pPr>
+      <w:r>
+        <w:rPr>
+          <w:rFonts w:eastAsia="等线" w:cs="Times New Roman" w:eastAsiaTheme="minorEastAsia" w:ascii="Times New Roman" w:hAnsi="Times New Roman"/>
           <w:b w:val="false"/>
-          <w:bCs w:val="false"/>
-          <w:color w:val="0F4761" w:themeColor="accent1" w:themeShade="bf"/>
-          <w:sz w:val="32"/>
-          <w:szCs w:val="32"/>
-        </w:rPr>
-        <w:t>1</w:t>
-      </w:r>
-      <w:r>
-        <w:rPr>
-          <w:rFonts w:eastAsia="等线 Light" w:cs="Times New Roman" w:cstheme="majorBidi" w:eastAsiaTheme="majorEastAsia" w:ascii="Times New Roman" w:hAnsi="Times New Roman"/>
-          <w:b w:val="false"/>
-          <w:bCs w:val="false"/>
-          <w:color w:val="0F4761" w:themeColor="accent1" w:themeShade="bf"/>
-          <w:sz w:val="32"/>
-          <w:szCs w:val="32"/>
-        </w:rPr>
-        <w:t>.4 Notes</w:t>
-      </w:r>
-    </w:p>
-    <w:p>
-      <w:pPr>
-        <w:pStyle w:val="Normal"/>
-        <w:rPr>
-          <w:rFonts w:ascii="Times New Roman" w:hAnsi="Times New Roman" w:cs="Times New Roman"/>
-        </w:rPr>
-      </w:pPr>
-      <w:r>
-        <w:rPr>
-          <w:rFonts w:cs="Times New Roman" w:ascii="Times New Roman" w:hAnsi="Times New Roman"/>
-        </w:rPr>
-        <w:t>These materials were mainly developed from simple interview-style questions and group discussion focused on the TA perspective. They were used to support the TA-related user stories and the first version of the low-fidelity prototype. At this stage, the purpose of these materials is to provide initial evidence for the report and help define the main TA-side functions more clearly.</w:t>
-      </w:r>
-    </w:p>
-    <w:p>
-      <w:pPr>
-        <w:pStyle w:val="Normal"/>
-        <w:rPr>
-          <w:rFonts w:ascii="Times New Roman" w:hAnsi="Times New Roman" w:cs="Times New Roman"/>
-        </w:rPr>
-      </w:pPr>
-      <w:r>
-        <w:rPr>
-          <w:rFonts w:cs="Times New Roman" w:ascii="Times New Roman" w:hAnsi="Times New Roman"/>
-        </w:rPr>
-        <w:t>Second, we discussed possible user needs within the group. Since each member focused on a different role, this helped us examine the system from multiple perspectives. In my part, I mainly focused on the TA side and considered what a student applicant would need during the application process.</w:t>
-      </w:r>
-    </w:p>
-    <w:p>
-      <w:pPr>
-        <w:pStyle w:val="Normal"/>
-        <w:rPr>
-          <w:rFonts w:ascii="Times New Roman" w:hAnsi="Times New Roman" w:cs="Times New Roman"/>
-        </w:rPr>
-      </w:pPr>
-      <w:r>
-        <w:rPr>
-          <w:rFonts w:cs="Times New Roman" w:ascii="Times New Roman" w:hAnsi="Times New Roman"/>
-        </w:rPr>
-        <w:t>Third, we prepared a few simple questions to think about the TA experience, such as what information should be shown in a job post, what applicants may need to upload, and whether they would want to check their application status. These findings were then used to refine the TA-related requirements and support the prototype design. The core TA functions we focused on included creating a profile, uploading a CV, finding available jobs, applying for jobs, and checking application status.</w:t>
+          <w:i w:val="false"/>
+          <w:caps w:val="false"/>
+          <w:smallCaps w:val="false"/>
+          <w:color w:val="000000"/>
+          <w:spacing w:val="0"/>
+          <w:kern w:val="2"/>
+          <w:sz w:val="24"/>
+          <w:szCs w:val="24"/>
+          <w:lang w:val="en-GB" w:eastAsia="zh-CN" w:bidi="ar-SA"/>
+          <w14:ligatures w14:val="standardContextual"/>
+        </w:rPr>
+        <w:t>Overall, these techniques helped the team identify initial requirements, clarify the project scope, and determine which functions should be prioritised in the first prototype. Since the first iteration could not cover every feature in equal depth, the prototype focused mainly on the TA-side workflow, while the needs of Module Organisers and administrators were retained in the wider backlog for later development. The detailed question lists and interview notes are included in the supporting materials as evidence for this stage of the requirement analysis.</w:t>
+      </w:r>
+    </w:p>
+    <w:p>
+      <w:pPr>
+        <w:pStyle w:val="Normal"/>
+        <w:rPr>
+          <w:rFonts w:ascii="Times New Roman" w:hAnsi="Times New Roman" w:cs="Times New Roman"/>
+        </w:rPr>
+      </w:pPr>
+      <w:r>
+        <w:rPr/>
       </w:r>
     </w:p>
     <w:p>
@@ -1405,7 +1380,7 @@
         <w:docPartGallery w:val="Page Numbers (Top of Page)"/>
         <w:docPartUnique w:val="true"/>
       </w:docPartObj>
-      <w:id w:val="1404374981"/>
+      <w:id w:val="656113680"/>
     </w:sdtPr>
     <w:sdtContent>
       <w:p>
@@ -1450,7 +1425,7 @@
             <w:bCs/>
             <w:rFonts w:cs="Times New Roman" w:ascii="Times New Roman" w:hAnsi="Times New Roman"/>
           </w:rPr>
-          <w:t>4</w:t>
+          <w:t>3</w:t>
         </w:r>
         <w:r>
           <w:rPr>
@@ -1496,7 +1471,7 @@
             <w:bCs/>
             <w:rFonts w:cs="Times New Roman" w:ascii="Times New Roman" w:hAnsi="Times New Roman"/>
           </w:rPr>
-          <w:t>4</w:t>
+          <w:t>3</w:t>
         </w:r>
         <w:r>
           <w:rPr>
@@ -1768,7 +1743,6 @@
       <w:rPr>
         <w:rFonts w:ascii="Aptos" w:hAnsi="Aptos" w:eastAsia="等线" w:cs="Arial" w:asciiTheme="minorHAnsi" w:cstheme="minorBidi" w:eastAsiaTheme="minorEastAsia" w:hAnsiTheme="minorHAnsi"/>
         <w:kern w:val="2"/>
-        <w:sz w:val="24"/>
         <w:szCs w:val="24"/>
         <w:lang w:val="en-GB" w:eastAsia="zh-CN" w:bidi="ar-SA"/>
         <w14:ligatures w14:val="standardContextual"/>
@@ -2164,6 +2138,7 @@
     <w:rsid w:val="0062598b"/>
     <w:pPr>
       <w:widowControl/>
+      <w:suppressAutoHyphens w:val="true"/>
       <w:bidi w:val="0"/>
       <w:spacing w:lineRule="auto" w:line="276" w:before="0" w:after="160"/>
       <w:jc w:val="left"/>

</xml_diff>